<commit_message>
v18.0.8.0.0: sunucudaki canlı kopya repoya alındı
/opt/odoo/custom_addons/l10n_tr_sovos_efatura (2026-06-23) içeriği,
düzenleme yapılmadan alındı. Hariç tutulanlar:
- services/schemas/ altındaki GİB XSD/Schematron dosyaları (.gitignore;
  sunucuda setup_schemas.sh ile kurulur, VERSION izlenir)
- kaynaklar/setup.exe (çalıştırılabilir dosya, modül kullanmıyor)
- kaynaklar/ altındaki bozuk adlı (#U0131) kopya xlsx
- __pycache__

Yeni: efatura.product.mapping, gelen fatura eşleme sihirbazı,
ubl_parser / incoming_matcher servisleri, XPath tabanlı iş kuralları,
setup_schemas.sh.

Co-Authored-By: Claude Opus 5.5 <noreply@anthropic.com>
Claude-Session: https://claude.ai/code/session_01JYS8F9NPgyrT19zypnrFHW
</commit_message>
<xml_diff>
--- a/dokumanlar/Odoo18_Sovos_eFatura_BRD.docx
+++ b/dokumanlar/Odoo18_Sovos_eFatura_BRD.docx
@@ -326,7 +326,7 @@
                 <w:sz w:val="18"/>
                 <w:szCs w:val="18"/>
               </w:rPr>
-              <w:t xml:space="preserve">1.0 — Haziran 2026</w:t>
+              <w:t xml:space="preserve">1.4 — Haziran 2026</w:t>
             </w:r>
           </w:p>
         </w:tc>
@@ -518,7 +518,7 @@
                 <w:sz w:val="18"/>
                 <w:szCs w:val="18"/>
               </w:rPr>
-              <w:t xml:space="preserve">Odoo 18 × Sovos e-Fatura Spec v6.0</w:t>
+              <w:t xml:space="preserve">Odoo 18 × Sovos e-Fatura Spec v8.0</w:t>
             </w:r>
           </w:p>
         </w:tc>
@@ -1609,7 +1609,7 @@
                 <w:sz w:val="18"/>
                 <w:szCs w:val="18"/>
               </w:rPr>
-              <w:t xml:space="preserve">Fatura düzenleme süresi — azami 7 gün</w:t>
+              <w:t xml:space="preserve">Fatura düzenleme süresi — azami 7 gün (VUK md.231). Desteklenen senaryolar: TICARIFATURA, TEMELFATURA, EARSIVFATURA. Kapsam dışı: IHRACAT, YOLCUBERABER</w:t>
             </w:r>
           </w:p>
         </w:tc>
@@ -4067,15 +4067,28 @@
             </w:tcMar>
           </w:tcPr>
           <w:p>
-            <w:r>
-              <w:rPr>
-                <w:rFonts w:ascii="Arial" w:cs="Arial" w:eastAsia="Arial" w:hAnsi="Arial"/>
-                <w:color w:val="1A1A1A"/>
-                <w:sz w:val="18"/>
-                <w:szCs w:val="18"/>
-              </w:rPr>
-              <w:t xml:space="preserve">account.move → UBL-TR 2.1/TR1.2 XML dönüşümü</w:t>
-            </w:r>
+            <w:del w:id="115" w:author="Claude" w:date="2026-06-13T00:00:00Z">
+              <w:r>
+                <w:rPr>
+                  <w:rFonts w:ascii="Arial" w:cs="Arial" w:eastAsia="Arial" w:hAnsi="Arial"/>
+                  <w:color w:val="1A1A1A"/>
+                  <w:sz w:val="18"/>
+                  <w:szCs w:val="18"/>
+                </w:rPr>
+                <w:delText xml:space="preserve">account.move → UBL-TR 2.1/TR1.2 XML dönüşümü</w:delText>
+              </w:r>
+            </w:del>
+            <w:ins w:id="116" w:author="Claude" w:date="2026-06-13T00:00:00Z">
+              <w:r>
+                <w:rPr>
+                  <w:rFonts w:ascii="Arial" w:cs="Arial" w:eastAsia="Arial" w:hAnsi="Arial"/>
+                  <w:color w:val="1A1A1A"/>
+                  <w:sz w:val="18"/>
+                  <w:szCs w:val="18"/>
+                </w:rPr>
+                <w:t xml:space="preserve">account.move → UBL-TR XML dönüşümü. Doğru değerler: UBLVersionID="2.1", CustomizationID="TR1.2" (katalog versiyonu UBL-TR 1.2.1'dir; UBLVersionID ile karıştırılmamalı). CopyIndicator alanı zorunludur: asıl fatura için "false", suret için "true". IssueTime zorunlu değildir; gönderilirse Saat:Dakika:Saniye formatında ve UTC/yerel saat tutarlılığı sağlanmalıdır. (UBL-TR Katalog v1.2.1)</w:t>
+              </w:r>
+            </w:ins>
           </w:p>
         </w:tc>
         <w:tc>
@@ -4775,15 +4788,28 @@
             </w:tcMar>
           </w:tcPr>
           <w:p>
-            <w:r>
-              <w:rPr>
-                <w:rFonts w:ascii="Arial" w:cs="Arial" w:eastAsia="Arial" w:hAnsi="Arial"/>
-                <w:color w:val="1A1A1A"/>
-                <w:sz w:val="18"/>
-                <w:szCs w:val="18"/>
-              </w:rPr>
-              <w:t xml:space="preserve">TRY dışı para birimi + döviz kuru zorunlu alan</w:t>
-            </w:r>
+            <w:del w:id="119" w:author="Claude" w:date="2026-06-13T00:00:00Z">
+              <w:r>
+                <w:rPr>
+                  <w:rFonts w:ascii="Arial" w:cs="Arial" w:eastAsia="Arial" w:hAnsi="Arial"/>
+                  <w:color w:val="1A1A1A"/>
+                  <w:sz w:val="18"/>
+                  <w:szCs w:val="18"/>
+                </w:rPr>
+                <w:delText xml:space="preserve">TRY dışı para birimi + döviz kuru zorunlu alan</w:delText>
+              </w:r>
+            </w:del>
+            <w:ins w:id="120" w:author="Claude" w:date="2026-06-13T00:00:00Z">
+              <w:r>
+                <w:rPr>
+                  <w:rFonts w:ascii="Arial" w:cs="Arial" w:eastAsia="Arial" w:hAnsi="Arial"/>
+                  <w:color w:val="1A1A1A"/>
+                  <w:sz w:val="18"/>
+                  <w:szCs w:val="18"/>
+                </w:rPr>
+                <w:t xml:space="preserve">TRY dışı para birimi + döviz kuru zorunlu alan. Edge case: %100 iskonto uygulanarak 0 tutarlı (0 KDV'li) fatura kesilebilir; bu durum için validasyon kuralı engel çıkarmamalı, sistem sıfır tutarlı faturayı geçerli kabul etmeli. (Sovos SSS Soru 9)</w:t>
+              </w:r>
+            </w:ins>
           </w:p>
         </w:tc>
         <w:tc>
@@ -5538,15 +5564,28 @@
             </w:tcMar>
           </w:tcPr>
           <w:p>
-            <w:r>
-              <w:rPr>
-                <w:rFonts w:ascii="Arial" w:cs="Arial" w:eastAsia="Arial" w:hAnsi="Arial"/>
-                <w:color w:val="1A1A1A"/>
-                <w:sz w:val="18"/>
-                <w:szCs w:val="18"/>
-              </w:rPr>
-              <w:t xml:space="preserve">ir.cron (15 dk) ile gelen fatura çekme</w:t>
-            </w:r>
+            <w:del w:id="109" w:author="Claude" w:date="2026-06-13T00:00:00Z">
+              <w:r>
+                <w:rPr>
+                  <w:rFonts w:ascii="Arial" w:cs="Arial" w:eastAsia="Arial" w:hAnsi="Arial"/>
+                  <w:color w:val="1A1A1A"/>
+                  <w:sz w:val="18"/>
+                  <w:szCs w:val="18"/>
+                </w:rPr>
+                <w:delText xml:space="preserve">ir.cron (15 dk) ile gelen fatura çekme</w:delText>
+              </w:r>
+            </w:del>
+            <w:ins w:id="110" w:author="Claude" w:date="2026-06-13T00:00:00Z">
+              <w:r>
+                <w:rPr>
+                  <w:rFonts w:ascii="Arial" w:cs="Arial" w:eastAsia="Arial" w:hAnsi="Arial"/>
+                  <w:color w:val="1A1A1A"/>
+                  <w:sz w:val="18"/>
+                  <w:szCs w:val="18"/>
+                </w:rPr>
+                <w:t xml:space="preserve">ir.cron (15 dk) ile gelen fatura çekme. ⚠ Kısıt: getUBLList maksimum 1 günlük tarih aralığı destekler; her 15 dk'lık sorguda FromDate-ToDate aralığı buna göre yönetilmeli. (Sovos SSS WS API Soru 3, Soru 5, Soru 10)</w:t>
+              </w:r>
+            </w:ins>
           </w:p>
         </w:tc>
         <w:tc>
@@ -5781,7 +5820,7 @@
                 <w:sz w:val="18"/>
                 <w:szCs w:val="18"/>
               </w:rPr>
-              <w:t xml:space="preserve">VKN ile res.partner otomatik eşleme</w:t>
+              <w:t xml:space="preserve">3 fazlı akıllı eşleme motoru (incoming_matcher): Faz 1 VKN kesin + ticari unvan fuzzy (difflib ≥0.85 otomatik, 0.60-0.84 öneri); Faz 2 öğrenen tablo (efatura_product_mapping) + UBL SellersItemIdentification kodu; Faz 3 bekletme kuyruğu + toplu onay wizard (sovos.incoming.match.wizard). Eşleme öğrenilir: bir kez onaylanınca aynı tedarikçiden aynı açıklama gelince otomatik uygulanır.</w:t>
             </w:r>
           </w:p>
         </w:tc>
@@ -5899,7 +5938,7 @@
                 <w:sz w:val="18"/>
                 <w:szCs w:val="18"/>
               </w:rPr>
-              <w:t xml:space="preserve">Draft fatura — kullanıcı elle eşler (Logo Tiger yaklaşımı)</w:t>
+              <w:t xml:space="preserve">Güven skoru &lt;0.60 → bekletme kuyruğu (x_efatura_match_status=pending). Kullanıcı "Bekleyen Gelen Faturalar" menüsünden toplu onay wizard'ını açar; partner ve ürün satırlarını eşler; onaylar → fatura oluşturulur + öğrenen tabloya kaydedilir.</w:t>
             </w:r>
           </w:p>
         </w:tc>
@@ -6246,15 +6285,28 @@
             </w:tcMar>
           </w:tcPr>
           <w:p>
-            <w:r>
-              <w:rPr>
-                <w:rFonts w:ascii="Arial" w:cs="Arial" w:eastAsia="Arial" w:hAnsi="Arial"/>
-                <w:color w:val="1A1A1A"/>
-                <w:sz w:val="18"/>
-                <w:szCs w:val="18"/>
-              </w:rPr>
-              <w:t xml:space="preserve">KABUL/RED ApplicationResponse gönderimi</w:t>
-            </w:r>
+            <w:del w:id="111" w:author="Claude" w:date="2026-06-13T00:00:00Z">
+              <w:r>
+                <w:rPr>
+                  <w:rFonts w:ascii="Arial" w:cs="Arial" w:eastAsia="Arial" w:hAnsi="Arial"/>
+                  <w:color w:val="1A1A1A"/>
+                  <w:sz w:val="18"/>
+                  <w:szCs w:val="18"/>
+                </w:rPr>
+                <w:delText xml:space="preserve">KABUL/RED ApplicationResponse gönderimi</w:delText>
+              </w:r>
+            </w:del>
+            <w:ins w:id="112" w:author="Claude" w:date="2026-06-13T00:00:00Z">
+              <w:r>
+                <w:rPr>
+                  <w:rFonts w:ascii="Arial" w:cs="Arial" w:eastAsia="Arial" w:hAnsi="Arial"/>
+                  <w:color w:val="1A1A1A"/>
+                  <w:sz w:val="18"/>
+                  <w:szCs w:val="18"/>
+                </w:rPr>
+                <w:t xml:space="preserve">KABUL/RED ApplicationResponse gönderimi. 8 gün içinde birden fazla uygulama yanıtı gönderilebilir; en son gönderilen geçerlidir. Kullanıcıya mevcut yanıt durumu gösterilmeli ve değiştirme imkânı sunulmalı. Bazı alıcı sistemler birden fazla yanıta izin vermeyebilir; bu durumda alıcı sistem güncellenmesi için bilgilendirme yapılır. (Sovos SSS Soru 5)</w:t>
+              </w:r>
+            </w:ins>
           </w:p>
         </w:tc>
         <w:tc>
@@ -8063,15 +8115,28 @@
             </w:tcMar>
           </w:tcPr>
           <w:p>
-            <w:r>
-              <w:rPr>
-                <w:rFonts w:ascii="Arial" w:cs="Arial" w:eastAsia="Arial" w:hAnsi="Arial"/>
-                <w:color w:val="1A1A1A"/>
-                <w:sz w:val="18"/>
-                <w:szCs w:val="18"/>
-              </w:rPr>
-              <w:t xml:space="preserve">Teknik hata: aynı UUID, ERP kaydına dokunma (Logo Tiger)</w:t>
-            </w:r>
+            <w:del w:id="101" w:author="Claude" w:date="2026-06-13T00:00:00Z">
+              <w:r>
+                <w:rPr>
+                  <w:rFonts w:ascii="Arial" w:cs="Arial" w:eastAsia="Arial" w:hAnsi="Arial"/>
+                  <w:color w:val="1A1A1A"/>
+                  <w:sz w:val="18"/>
+                  <w:szCs w:val="18"/>
+                </w:rPr>
+                <w:delText xml:space="preserve">Teknik hata: aynı UUID, ERP kaydına dokunma (Logo Tiger)</w:delText>
+              </w:r>
+            </w:del>
+            <w:ins w:id="102" w:author="Claude" w:date="2026-06-13T00:00:00Z">
+              <w:r>
+                <w:rPr>
+                  <w:rFonts w:ascii="Arial" w:cs="Arial" w:eastAsia="Arial" w:hAnsi="Arial"/>
+                  <w:color w:val="1A1A1A"/>
+                  <w:sz w:val="18"/>
+                  <w:szCs w:val="18"/>
+                </w:rPr>
+                <w:t xml:space="preserve">Teknik hata yeniden gönderimi: Fatura ID (numara) aynı kalır; yeni zarf, yeni fatura UUID ve yeni uygulama yanıtı UUID ile yeni gönderim yapılır. ERP kaydına dokunulmaz. (Sovos SSS Soru 18)</w:t>
+              </w:r>
+            </w:ins>
           </w:p>
         </w:tc>
         <w:tc>
@@ -8181,15 +8246,28 @@
             </w:tcMar>
           </w:tcPr>
           <w:p>
-            <w:r>
-              <w:rPr>
-                <w:rFonts w:ascii="Arial" w:cs="Arial" w:eastAsia="Arial" w:hAnsi="Arial"/>
-                <w:color w:val="1A1A1A"/>
-                <w:sz w:val="18"/>
-                <w:szCs w:val="18"/>
-              </w:rPr>
-              <w:t xml:space="preserve">Sovos CancelInvoice() API — GİB portala gitme yok</w:t>
-            </w:r>
+            <w:del w:id="113" w:author="Claude" w:date="2026-06-13T00:00:00Z">
+              <w:r>
+                <w:rPr>
+                  <w:rFonts w:ascii="Arial" w:cs="Arial" w:eastAsia="Arial" w:hAnsi="Arial"/>
+                  <w:color w:val="1A1A1A"/>
+                  <w:sz w:val="18"/>
+                  <w:szCs w:val="18"/>
+                </w:rPr>
+                <w:delText xml:space="preserve">Sovos CancelInvoice() API — GİB portala gitme yok</w:delText>
+              </w:r>
+            </w:del>
+            <w:ins w:id="114" w:author="Claude" w:date="2026-06-13T00:00:00Z">
+              <w:r>
+                <w:rPr>
+                  <w:rFonts w:ascii="Arial" w:cs="Arial" w:eastAsia="Arial" w:hAnsi="Arial"/>
+                  <w:color w:val="1A1A1A"/>
+                  <w:sz w:val="18"/>
+                  <w:szCs w:val="18"/>
+                </w:rPr>
+                <w:t xml:space="preserve">Sovos CancelInvoice() API — GİB portala gitme yok. ⚠ Kısmi iptal mümkün değildir; tam iptal sonrası yeni tutar ile yeni fatura kesilir. ⚠ İptal edilen faturanın seri numarası tekrar kullanılamaz; sıradaki numara ile devam edilir. Kullanıcıya bu kısıtlar onay ekranında açıkça gösterilmeli. (Sovos SSS eArşiv Soru 5, Soru 6)</w:t>
+              </w:r>
+            </w:ins>
           </w:p>
         </w:tc>
         <w:tc>
@@ -8299,15 +8377,28 @@
             </w:tcMar>
           </w:tcPr>
           <w:p>
-            <w:r>
-              <w:rPr>
-                <w:rFonts w:ascii="Arial" w:cs="Arial" w:eastAsia="Arial" w:hAnsi="Arial"/>
-                <w:color w:val="1A1A1A"/>
-                <w:sz w:val="18"/>
-                <w:szCs w:val="18"/>
-              </w:rPr>
-              <w:t xml:space="preserve">GİB portal yönlendirme + checkbox onay (Logo Tiger)</w:t>
-            </w:r>
+            <w:del w:id="105" w:author="Claude" w:date="2026-06-13T00:00:00Z">
+              <w:r>
+                <w:rPr>
+                  <w:rFonts w:ascii="Arial" w:cs="Arial" w:eastAsia="Arial" w:hAnsi="Arial"/>
+                  <w:color w:val="1A1A1A"/>
+                  <w:sz w:val="18"/>
+                  <w:szCs w:val="18"/>
+                </w:rPr>
+                <w:delText xml:space="preserve">GİB portal yönlendirme + checkbox onay (Logo Tiger)</w:delText>
+              </w:r>
+            </w:del>
+            <w:ins w:id="106" w:author="Claude" w:date="2026-06-13T00:00:00Z">
+              <w:r>
+                <w:rPr>
+                  <w:rFonts w:ascii="Arial" w:cs="Arial" w:eastAsia="Arial" w:hAnsi="Arial"/>
+                  <w:color w:val="1A1A1A"/>
+                  <w:sz w:val="18"/>
+                  <w:szCs w:val="18"/>
+                </w:rPr>
+                <w:t xml:space="preserve">1300 statüsüne ulaşmış TEMELFATURA iptal edilemez. Kullanıcıya iki seçenek sunulur: (1) Alıcıdan iade e-Faturası istenmesi — GİB portal bağlantısı + onay checkbox'ı; (2) Alıcı muhasebesine kaydedilmemişse noter veya KEP (Kayıtlı Elektronik Posta) kanalıyla itiraz. (Sovos SSS Soru 4)</w:t>
+              </w:r>
+            </w:ins>
           </w:p>
         </w:tc>
         <w:tc>
@@ -8535,15 +8626,28 @@
             </w:tcMar>
           </w:tcPr>
           <w:p>
-            <w:r>
-              <w:rPr>
-                <w:rFonts w:ascii="Arial" w:cs="Arial" w:eastAsia="Arial" w:hAnsi="Arial"/>
-                <w:color w:val="1A1A1A"/>
-                <w:sz w:val="18"/>
-                <w:szCs w:val="18"/>
-              </w:rPr>
-              <w:t xml:space="preserve">Zorunlu alan hatası: düzelt + aynı UUID tekrar gönder</w:t>
-            </w:r>
+            <w:del w:id="103" w:author="Claude" w:date="2026-06-13T00:00:00Z">
+              <w:r>
+                <w:rPr>
+                  <w:rFonts w:ascii="Arial" w:cs="Arial" w:eastAsia="Arial" w:hAnsi="Arial"/>
+                  <w:color w:val="1A1A1A"/>
+                  <w:sz w:val="18"/>
+                  <w:szCs w:val="18"/>
+                </w:rPr>
+                <w:delText xml:space="preserve">Zorunlu alan hatası: düzelt + aynı UUID tekrar gönder</w:delText>
+              </w:r>
+            </w:del>
+            <w:ins w:id="104" w:author="Claude" w:date="2026-06-13T00:00:00Z">
+              <w:r>
+                <w:rPr>
+                  <w:rFonts w:ascii="Arial" w:cs="Arial" w:eastAsia="Arial" w:hAnsi="Arial"/>
+                  <w:color w:val="1A1A1A"/>
+                  <w:sz w:val="18"/>
+                  <w:szCs w:val="18"/>
+                </w:rPr>
+                <w:t xml:space="preserve">Zorunlu alan/şema hatası (GİB veya alıcı sistemden hata döndü): faturayı düzelt, Fatura ID aynı kalsın, yeni UUID ile yeniden gönder. ⚠ Dikkat: aynı UUID ile yeniden gönderim 1163 (mükerrer UUID) hatasına yol açar. (Sovos SSS Soru 18)</w:t>
+              </w:r>
+            </w:ins>
           </w:p>
         </w:tc>
         <w:tc>
@@ -15207,15 +15311,18 @@
             </w:tcMar>
           </w:tcPr>
           <w:p>
-            <w:r>
-              <w:rPr>
-                <w:rFonts w:ascii="Arial" w:cs="Arial" w:eastAsia="Arial" w:hAnsi="Arial"/>
-                <w:color w:val="1A1A1A"/>
-                <w:sz w:val="18"/>
-                <w:szCs w:val="18"/>
-              </w:rPr>
-              <w:t xml:space="preserve">1215 kodu için admin bildirim tekrarsız gidenş kontrolü</w:t>
-            </w:r>
+            <w:del w:id="117" w:author="Claude" w:date="2026-06-13T00:00:00Z">
+              <w:r>
+                <w:rPr/>
+                <w:delText xml:space="preserve">1215 kodu için admin bildirim tekrarsız gidenş kontrolü</w:delText>
+              </w:r>
+            </w:del>
+            <w:ins w:id="118" w:author="Claude" w:date="2026-06-13T00:00:00Z">
+              <w:r>
+                <w:rPr/>
+                <w:t xml:space="preserve">1215 (DOKUMAN GONDERIMI BASARISIZ — TEKRAR GONDERME SONLANDI) kodu için admin bildirim; tekrarsız gönderim kontrolü. ⚠ Kritik: 1215 durumundaki zarftaki fatura ve uygulama yanıtları hükümsüz sayılır ve kesinlikle tekrar gönderilmemelidir. Bunun yerine yeni UUID ile yeni gönderim başlatılır. (Sovos SSS Soru 18)</w:t>
+              </w:r>
+            </w:ins>
           </w:p>
         </w:tc>
       </w:tr>
@@ -16349,7 +16456,7 @@
                 <w:sz w:val="18"/>
                 <w:szCs w:val="18"/>
               </w:rPr>
-              <w:t xml:space="preserve">GetUserList</w:t>
+              <w:t xml:space="preserve">GetUserList — VKN'yi PK etiketine (alias) çevirir. ReceiverIdentifier'a VKN değil alias gönderilir; alias boşsa 1181 hatası alınır. Sorgu sıklığı: günde 1 kez (Sovos SSS)</w:t>
             </w:r>
           </w:p>
         </w:tc>
@@ -18740,15 +18847,28 @@
             </w:tcMar>
           </w:tcPr>
           <w:p>
-            <w:r>
-              <w:rPr>
-                <w:rFonts w:ascii="Arial" w:cs="Arial" w:eastAsia="Arial" w:hAnsi="Arial"/>
-                <w:color w:val="1A1A1A"/>
-                <w:sz w:val="18"/>
-                <w:szCs w:val="18"/>
-              </w:rPr>
-              <w:t xml:space="preserve">Teknik hata durumunda aynı UUID ile yeniden gönderim</w:t>
-            </w:r>
+            <w:del w:id="107" w:author="Claude" w:date="2026-06-13T00:00:00Z">
+              <w:r>
+                <w:rPr>
+                  <w:rFonts w:ascii="Arial" w:cs="Arial" w:eastAsia="Arial" w:hAnsi="Arial"/>
+                  <w:color w:val="1A1A1A"/>
+                  <w:sz w:val="18"/>
+                  <w:szCs w:val="18"/>
+                </w:rPr>
+                <w:delText xml:space="preserve">Teknik hata durumunda aynı UUID ile yeniden gönderim</w:delText>
+              </w:r>
+            </w:del>
+            <w:ins w:id="108" w:author="Claude" w:date="2026-06-13T00:00:00Z">
+              <w:r>
+                <w:rPr>
+                  <w:rFonts w:ascii="Arial" w:cs="Arial" w:eastAsia="Arial" w:hAnsi="Arial"/>
+                  <w:color w:val="1A1A1A"/>
+                  <w:sz w:val="18"/>
+                  <w:szCs w:val="18"/>
+                </w:rPr>
+                <w:t xml:space="preserve">Teknik hata durumunda yeniden gönderimde Fatura ID aynı kalır, UUID değişir; 1163 (mükerrer UUID) hatası oluşmaz</w:t>
+              </w:r>
+            </w:ins>
           </w:p>
         </w:tc>
         <w:tc>
@@ -23127,7 +23247,7 @@
                 <w:sz w:val="18"/>
                 <w:szCs w:val="18"/>
               </w:rPr>
-              <w:t xml:space="preserve">Tam GİB durum kodu listesi</w:t>
+              <w:t xml:space="preserve">Tam GİB durum kodu listesi — Yeni: 1200 (zarf işlendi/GIB_PENDING), 1220 (hedeften yanıt yok/GIB_PENDING — TEKRAR GÖNDERİLMEZ), 1176–1177 (imza yetkisiz/GIB_SOVOS_SUPPORT), 1180–1183 (adres hataları/GIB_RETRY_SAME_UUID), 1190–1195 (sistem hatası/GIB_RETRY_SAME_UUID)</w:t>
             </w:r>
           </w:p>
         </w:tc>
@@ -26642,150 +26762,33 @@
             </w:r>
           </w:p>
         </w:tc>
-        <w:tc>
-          <w:tcPr>
-            <w:tcW w:type="dxa" w:w="2000"/>
-            <w:tcBorders>
-              <w:top w:val="single" w:color="BBBBBB" w:sz="1"/>
-              <w:left w:val="single" w:color="BBBBBB" w:sz="1"/>
-              <w:bottom w:val="single" w:color="BBBBBB" w:sz="1"/>
-              <w:right w:val="single" w:color="BBBBBB" w:sz="1"/>
-            </w:tcBorders>
-            <w:shd w:fill="FFFFFF" w:val="clear"/>
-            <w:tcMar>
-              <w:top w:type="dxa" w:w="80"/>
-              <w:left w:type="dxa" w:w="120"/>
-              <w:bottom w:type="dxa" w:w="80"/>
-              <w:right w:type="dxa" w:w="120"/>
-            </w:tcMar>
-          </w:tcPr>
-          <w:p>
-            <w:r>
-              <w:rPr>
-                <w:rFonts w:ascii="Arial" w:cs="Arial" w:eastAsia="Arial" w:hAnsi="Arial"/>
-                <w:color w:val="1A1A1A"/>
-                <w:sz w:val="18"/>
-                <w:szCs w:val="18"/>
-              </w:rPr>
-              <w:t xml:space="preserve">Proje Analiz</w:t>
-            </w:r>
-          </w:p>
-        </w:tc>
       </w:tr>
       <w:tr>
         <w:tc>
-          <w:tcPr>
-            <w:tcW w:type="dxa" w:w="1200"/>
-            <w:tcBorders>
-              <w:top w:val="single" w:color="BBBBBB" w:sz="1"/>
-              <w:left w:val="single" w:color="BBBBBB" w:sz="1"/>
-              <w:bottom w:val="single" w:color="BBBBBB" w:sz="1"/>
-              <w:right w:val="single" w:color="BBBBBB" w:sz="1"/>
-            </w:tcBorders>
-            <w:shd w:fill="F4F4F4" w:val="clear"/>
-            <w:tcMar>
-              <w:top w:type="dxa" w:w="80"/>
-              <w:left w:type="dxa" w:w="120"/>
-              <w:bottom w:type="dxa" w:w="80"/>
-              <w:right w:type="dxa" w:w="120"/>
-            </w:tcMar>
-          </w:tcPr>
-          <w:p>
-            <w:r>
-              <w:rPr>
-                <w:rFonts w:ascii="Arial" w:cs="Arial" w:eastAsia="Arial" w:hAnsi="Arial"/>
-                <w:color w:val="1A1A1A"/>
-                <w:sz w:val="18"/>
-                <w:szCs w:val="18"/>
-              </w:rPr>
-              <w:t xml:space="preserve">1.1</w:t>
-            </w:r>
-          </w:p>
-        </w:tc>
-        <w:tc>
-          <w:tcPr>
-            <w:tcW w:type="dxa" w:w="1600"/>
-            <w:tcBorders>
-              <w:top w:val="single" w:color="BBBBBB" w:sz="1"/>
-              <w:left w:val="single" w:color="BBBBBB" w:sz="1"/>
-              <w:bottom w:val="single" w:color="BBBBBB" w:sz="1"/>
-              <w:right w:val="single" w:color="BBBBBB" w:sz="1"/>
-            </w:tcBorders>
-            <w:shd w:fill="F4F4F4" w:val="clear"/>
-            <w:tcMar>
-              <w:top w:type="dxa" w:w="80"/>
-              <w:left w:type="dxa" w:w="120"/>
-              <w:bottom w:type="dxa" w:w="80"/>
-              <w:right w:type="dxa" w:w="120"/>
-            </w:tcMar>
-          </w:tcPr>
-          <w:p>
-            <w:r>
-              <w:rPr>
-                <w:rFonts w:ascii="Arial" w:cs="Arial" w:eastAsia="Arial" w:hAnsi="Arial"/>
-                <w:color w:val="1A1A1A"/>
-                <w:sz w:val="18"/>
-                <w:szCs w:val="18"/>
-              </w:rPr>
-              <w:t xml:space="preserve">Haziran 2026</w:t>
-            </w:r>
-          </w:p>
-        </w:tc>
-        <w:tc>
-          <w:tcPr>
-            <w:tcW w:type="dxa" w:w="4226"/>
-            <w:tcBorders>
-              <w:top w:val="single" w:color="BBBBBB" w:sz="1"/>
-              <w:left w:val="single" w:color="BBBBBB" w:sz="1"/>
-              <w:bottom w:val="single" w:color="BBBBBB" w:sz="1"/>
-              <w:right w:val="single" w:color="BBBBBB" w:sz="1"/>
-            </w:tcBorders>
-            <w:shd w:fill="F4F4F4" w:val="clear"/>
-            <w:tcMar>
-              <w:top w:type="dxa" w:w="80"/>
-              <w:left w:type="dxa" w:w="120"/>
-              <w:bottom w:type="dxa" w:w="80"/>
-              <w:right w:type="dxa" w:w="120"/>
-            </w:tcMar>
-          </w:tcPr>
-          <w:p>
-            <w:r>
-              <w:rPr>
-                <w:rFonts w:ascii="Arial" w:cs="Arial" w:eastAsia="Arial" w:hAnsi="Arial"/>
-                <w:color w:val="1A1A1A"/>
-                <w:sz w:val="18"/>
-                <w:szCs w:val="18"/>
-              </w:rPr>
-              <w:t xml:space="preserve">Kod incelemesi sonrası revizyon: x_efatura_type_updated tipi Datetime→Date düzeltildi; eksik alanlar eklendi (x_gib_status_code, x_efatura_alias, x_sovos_identifier, x_sovos_admin_email); Schematron referansı güncellendi (pre-compiled .sch.xsl)</w:t>
-            </w:r>
-          </w:p>
-        </w:tc>
-        <w:tc>
-          <w:tcPr>
-            <w:tcW w:type="dxa" w:w="2000"/>
-            <w:tcBorders>
-              <w:top w:val="single" w:color="BBBBBB" w:sz="1"/>
-              <w:left w:val="single" w:color="BBBBBB" w:sz="1"/>
-              <w:bottom w:val="single" w:color="BBBBBB" w:sz="1"/>
-              <w:right w:val="single" w:color="BBBBBB" w:sz="1"/>
-            </w:tcBorders>
-            <w:shd w:fill="F4F4F4" w:val="clear"/>
-            <w:tcMar>
-              <w:top w:type="dxa" w:w="80"/>
-              <w:left w:type="dxa" w:w="120"/>
-              <w:bottom w:type="dxa" w:w="80"/>
-              <w:right w:type="dxa" w:w="120"/>
-            </w:tcMar>
-          </w:tcPr>
-          <w:p>
-            <w:r>
-              <w:rPr>
-                <w:rFonts w:ascii="Arial" w:cs="Arial" w:eastAsia="Arial" w:hAnsi="Arial"/>
-                <w:color w:val="1A1A1A"/>
-                <w:sz w:val="18"/>
-                <w:szCs w:val="18"/>
-              </w:rPr>
-              <w:t xml:space="preserve">Proje Analiz</w:t>
+          <w:p>
+            <w:r>
+              <w:t>1.4</w:t>
+            </w:r>
+          </w:p>
+        </w:tc>
+        <w:tc>
+          <w:p>
+            <w:r>
+              <w:t>Haziran 2026</w:t>
+            </w:r>
+          </w:p>
+        </w:tc>
+        <w:tc>
+          <w:p>
+            <w:r>
+              <w:t xml:space="preserve">v8 uyum revizyonu: saxonche→lxml XPath (ubl_validator); yeni bileşenler eklendi (ubl_parser, incoming_matcher, efatura_product_mapping, incoming_invoice_match_wizard — 3 fazlı öğrenen eşleme motoru); FR-18/19 akıllı eşleme ile güncellendi; tests/__init__.py 4 yeni modül; kapak v1.4 / Spec v8.0; İlgili Spec güncellendi</w:t>
+            </w:r>
+          </w:p>
+        </w:tc>
+        <w:tc>
+          <w:p>
+            <w:r>
+              <w:t>Proje Analiz</w:t>
             </w:r>
           </w:p>
         </w:tc>
@@ -26793,6 +26796,37 @@
       <w:tr>
         <w:tc>
           <w:tcPr>
+            <w:tcW w:type="dxa" w:w="2000"/>
+            <w:tcBorders>
+              <w:top w:val="single" w:color="BBBBBB" w:sz="1"/>
+              <w:left w:val="single" w:color="BBBBBB" w:sz="1"/>
+              <w:bottom w:val="single" w:color="BBBBBB" w:sz="1"/>
+              <w:right w:val="single" w:color="BBBBBB" w:sz="1"/>
+            </w:tcBorders>
+            <w:shd w:fill="FFFFFF" w:val="clear"/>
+            <w:tcMar>
+              <w:top w:type="dxa" w:w="80"/>
+              <w:left w:type="dxa" w:w="120"/>
+              <w:bottom w:type="dxa" w:w="80"/>
+              <w:right w:type="dxa" w:w="120"/>
+            </w:tcMar>
+          </w:tcPr>
+          <w:p>
+            <w:r>
+              <w:rPr>
+                <w:rFonts w:ascii="Arial" w:cs="Arial" w:eastAsia="Arial" w:hAnsi="Arial"/>
+                <w:color w:val="1A1A1A"/>
+                <w:sz w:val="18"/>
+                <w:szCs w:val="18"/>
+              </w:rPr>
+              <w:t xml:space="preserve">Proje Analiz</w:t>
+            </w:r>
+          </w:p>
+        </w:tc>
+      </w:tr>
+      <w:tr>
+        <w:tc>
+          <w:tcPr>
             <w:tcW w:type="dxa" w:w="1200"/>
             <w:tcBorders>
               <w:top w:val="single" w:color="BBBBBB" w:sz="1"/>
@@ -26800,6 +26834,124 @@
               <w:bottom w:val="single" w:color="BBBBBB" w:sz="1"/>
               <w:right w:val="single" w:color="BBBBBB" w:sz="1"/>
             </w:tcBorders>
+            <w:shd w:fill="F4F4F4" w:val="clear"/>
+            <w:tcMar>
+              <w:top w:type="dxa" w:w="80"/>
+              <w:left w:type="dxa" w:w="120"/>
+              <w:bottom w:type="dxa" w:w="80"/>
+              <w:right w:type="dxa" w:w="120"/>
+            </w:tcMar>
+          </w:tcPr>
+          <w:p>
+            <w:r>
+              <w:rPr>
+                <w:rFonts w:ascii="Arial" w:cs="Arial" w:eastAsia="Arial" w:hAnsi="Arial"/>
+                <w:color w:val="1A1A1A"/>
+                <w:sz w:val="18"/>
+                <w:szCs w:val="18"/>
+              </w:rPr>
+              <w:t xml:space="preserve">1.1</w:t>
+            </w:r>
+          </w:p>
+        </w:tc>
+        <w:tc>
+          <w:tcPr>
+            <w:tcW w:type="dxa" w:w="1600"/>
+            <w:tcBorders>
+              <w:top w:val="single" w:color="BBBBBB" w:sz="1"/>
+              <w:left w:val="single" w:color="BBBBBB" w:sz="1"/>
+              <w:bottom w:val="single" w:color="BBBBBB" w:sz="1"/>
+              <w:right w:val="single" w:color="BBBBBB" w:sz="1"/>
+            </w:tcBorders>
+            <w:shd w:fill="F4F4F4" w:val="clear"/>
+            <w:tcMar>
+              <w:top w:type="dxa" w:w="80"/>
+              <w:left w:type="dxa" w:w="120"/>
+              <w:bottom w:type="dxa" w:w="80"/>
+              <w:right w:type="dxa" w:w="120"/>
+            </w:tcMar>
+          </w:tcPr>
+          <w:p>
+            <w:r>
+              <w:rPr>
+                <w:rFonts w:ascii="Arial" w:cs="Arial" w:eastAsia="Arial" w:hAnsi="Arial"/>
+                <w:color w:val="1A1A1A"/>
+                <w:sz w:val="18"/>
+                <w:szCs w:val="18"/>
+              </w:rPr>
+              <w:t xml:space="preserve">Haziran 2026</w:t>
+            </w:r>
+          </w:p>
+        </w:tc>
+        <w:tc>
+          <w:tcPr>
+            <w:tcW w:type="dxa" w:w="4226"/>
+            <w:tcBorders>
+              <w:top w:val="single" w:color="BBBBBB" w:sz="1"/>
+              <w:left w:val="single" w:color="BBBBBB" w:sz="1"/>
+              <w:bottom w:val="single" w:color="BBBBBB" w:sz="1"/>
+              <w:right w:val="single" w:color="BBBBBB" w:sz="1"/>
+            </w:tcBorders>
+            <w:shd w:fill="F4F4F4" w:val="clear"/>
+            <w:tcMar>
+              <w:top w:type="dxa" w:w="80"/>
+              <w:left w:type="dxa" w:w="120"/>
+              <w:bottom w:type="dxa" w:w="80"/>
+              <w:right w:type="dxa" w:w="120"/>
+            </w:tcMar>
+          </w:tcPr>
+          <w:p>
+            <w:r>
+              <w:rPr>
+                <w:rFonts w:ascii="Arial" w:cs="Arial" w:eastAsia="Arial" w:hAnsi="Arial"/>
+                <w:color w:val="1A1A1A"/>
+                <w:sz w:val="18"/>
+                <w:szCs w:val="18"/>
+              </w:rPr>
+              <w:t xml:space="preserve">Kod incelemesi sonrası revizyon: x_efatura_type_updated tipi Datetime→Date düzeltildi; eksik alanlar eklendi (x_gib_status_code, x_efatura_alias, x_sovos_identifier, x_sovos_admin_email); Schematron referansı güncellendi (pre-compiled .sch.xsl)</w:t>
+            </w:r>
+          </w:p>
+        </w:tc>
+        <w:tc>
+          <w:tcPr>
+            <w:tcW w:type="dxa" w:w="2000"/>
+            <w:tcBorders>
+              <w:top w:val="single" w:color="BBBBBB" w:sz="1"/>
+              <w:left w:val="single" w:color="BBBBBB" w:sz="1"/>
+              <w:bottom w:val="single" w:color="BBBBBB" w:sz="1"/>
+              <w:right w:val="single" w:color="BBBBBB" w:sz="1"/>
+            </w:tcBorders>
+            <w:shd w:fill="F4F4F4" w:val="clear"/>
+            <w:tcMar>
+              <w:top w:type="dxa" w:w="80"/>
+              <w:left w:type="dxa" w:w="120"/>
+              <w:bottom w:type="dxa" w:w="80"/>
+              <w:right w:type="dxa" w:w="120"/>
+            </w:tcMar>
+          </w:tcPr>
+          <w:p>
+            <w:r>
+              <w:rPr>
+                <w:rFonts w:ascii="Arial" w:cs="Arial" w:eastAsia="Arial" w:hAnsi="Arial"/>
+                <w:color w:val="1A1A1A"/>
+                <w:sz w:val="18"/>
+                <w:szCs w:val="18"/>
+              </w:rPr>
+              <w:t xml:space="preserve">Proje Analiz</w:t>
+            </w:r>
+          </w:p>
+        </w:tc>
+      </w:tr>
+      <w:tr>
+        <w:tc>
+          <w:tcPr>
+            <w:tcW w:type="dxa" w:w="1200"/>
+            <w:tcBorders>
+              <w:top w:val="single" w:color="BBBBBB" w:sz="1"/>
+              <w:left w:val="single" w:color="BBBBBB" w:sz="1"/>
+              <w:bottom w:val="single" w:color="BBBBBB" w:sz="1"/>
+              <w:right w:val="single" w:color="BBBBBB" w:sz="1"/>
+            </w:tcBorders>
             <w:shd w:fill="FFFFFF" w:val="clear"/>
             <w:tcMar>
               <w:top w:type="dxa" w:w="80"/>
@@ -26874,7 +27026,7 @@
                 <w:sz w:val="18"/>
                 <w:szCs w:val="18"/>
               </w:rPr>
-              <w:t xml:space="preserve">v6.1 kodu incelemesi: x_gib_admin_notified alanı eklendi; GİB durum setleri constants.py tek kaynağa taşındı; saxonche yoksa UserError (sessizce atlama yok); TICARIFATURA sent durumu iptal bloklandı; VERSION derleme talimatı Saxon HE ile düzeltildi</w:t>
+              <w:t xml:space="preserve">v6.1 kodu incelemesi: x_gib_admin_notified alanı eklendi; GİB durum setleri constants.py tek kaynağa taşındı; saxonche yoksa UserError; TICARIFATURA sent durumu iptal bloklandı; VERSION derleme talimatı Saxon HE ile düzeltildi. Kaynak belge incelemesi (Sovos PDF/Excel/API): 1200, 1220, 1176–1177, 1180–1183, 1190–1195 kodları eklendi; ReceiverIdentifier alias-only düzeltildi; getUBLList limit, getUserList günlük tavsiye, 7 gün VUK, IHRACAT kapsam dışı notları eklendi</w:t>
             </w:r>
           </w:p>
         </w:tc>
@@ -26905,6 +27057,132 @@
               </w:rPr>
               <w:t xml:space="preserve">Proje Analiz</w:t>
             </w:r>
+          </w:p>
+        </w:tc>
+      </w:tr>
+      <w:tr>
+        <w:tc>
+          <w:tcPr>
+            <w:tcW w:type="dxa" w:w="1000"/>
+            <w:tcBorders>
+              <w:top w:val="single" w:color="BBBBBB" w:sz="1"/>
+              <w:left w:val="single" w:color="BBBBBB" w:sz="1"/>
+              <w:bottom w:val="single" w:color="BBBBBB" w:sz="1"/>
+              <w:right w:val="single" w:color="BBBBBB" w:sz="1"/>
+            </w:tcBorders>
+            <w:shd w:fill="FFFFFF" w:val="clear"/>
+            <w:tcMar>
+              <w:top w:type="dxa" w:w="80"/>
+              <w:left w:type="dxa" w:w="120"/>
+              <w:bottom w:type="dxa" w:w="80"/>
+              <w:right w:type="dxa" w:w="120"/>
+            </w:tcMar>
+          </w:tcPr>
+          <w:p>
+            <w:ins w:id="121" w:author="Claude" w:date="2026-06-13T00:00:00Z">
+              <w:r>
+                <w:rPr>
+                  <w:rFonts w:ascii="Arial" w:cs="Arial" w:eastAsia="Arial" w:hAnsi="Arial"/>
+                  <w:color w:val="1A1A1A"/>
+                  <w:sz w:val="18"/>
+                  <w:szCs w:val="18"/>
+                </w:rPr>
+                <w:t xml:space="preserve">1.3</w:t>
+              </w:r>
+            </w:ins>
+          </w:p>
+        </w:tc>
+        <w:tc>
+          <w:tcPr>
+            <w:tcW w:type="dxa" w:w="1500"/>
+            <w:tcBorders>
+              <w:top w:val="single" w:color="BBBBBB" w:sz="1"/>
+              <w:left w:val="single" w:color="BBBBBB" w:sz="1"/>
+              <w:bottom w:val="single" w:color="BBBBBB" w:sz="1"/>
+              <w:right w:val="single" w:color="BBBBBB" w:sz="1"/>
+            </w:tcBorders>
+            <w:shd w:fill="FFFFFF" w:val="clear"/>
+            <w:tcMar>
+              <w:top w:type="dxa" w:w="80"/>
+              <w:left w:type="dxa" w:w="120"/>
+              <w:bottom w:type="dxa" w:w="80"/>
+              <w:right w:type="dxa" w:w="120"/>
+            </w:tcMar>
+          </w:tcPr>
+          <w:p>
+            <w:ins w:id="122" w:author="Claude" w:date="2026-06-13T00:00:00Z">
+              <w:r>
+                <w:rPr>
+                  <w:rFonts w:ascii="Arial" w:cs="Arial" w:eastAsia="Arial" w:hAnsi="Arial"/>
+                  <w:color w:val="1A1A1A"/>
+                  <w:sz w:val="18"/>
+                  <w:szCs w:val="18"/>
+                </w:rPr>
+                <w:t xml:space="preserve">Haziran 2026</w:t>
+              </w:r>
+            </w:ins>
+          </w:p>
+        </w:tc>
+        <w:tc>
+          <w:tcPr>
+            <w:tcW w:type="dxa" w:w="4526"/>
+            <w:tcBorders>
+              <w:top w:val="single" w:color="BBBBBB" w:sz="1"/>
+              <w:left w:val="single" w:color="BBBBBB" w:sz="1"/>
+              <w:bottom w:val="single" w:color="BBBBBB" w:sz="1"/>
+              <w:right w:val="single" w:color="BBBBBB" w:sz="1"/>
+            </w:tcBorders>
+            <w:shd w:fill="FFFFFF" w:val="clear"/>
+            <w:tcMar>
+              <w:top w:type="dxa" w:w="80"/>
+              <w:left w:type="dxa" w:w="120"/>
+              <w:bottom w:type="dxa" w:w="80"/>
+              <w:right w:type="dxa" w:w="120"/>
+            </w:tcMar>
+          </w:tcPr>
+          <w:p>
+            <w:ins w:id="123" w:author="Claude" w:date="2026-06-13T00:00:00Z">
+              <w:r>
+                <w:rPr>
+                  <w:rFonts w:ascii="Arial" w:cs="Arial" w:eastAsia="Arial" w:hAnsi="Arial"/>
+                  <w:color w:val="1A1A1A"/>
+                  <w:sz w:val="18"/>
+                  <w:szCs w:val="18"/>
+                </w:rPr>
+                <w:t xml:space="preserve">Sovos SSS ve UBL-TR Katalog kaynak incelemesi: FR-33/FR-37 UUID davranışı düzeltildi (Fatura ID aynı kalır, UUID değişir); FR-35 TEMELFATURA iptali için noter/KEP seçeneği eklendi; FR-16 getUBLList 1 günlük tarih aralığı kısıtı belgelendi; FR-22 çoklu uygulama yanıtı ve son geçerlilik kuralı eklendi; FR-34 e-Arşiv kısmi iptal yasağı ve seri numarası tekrar kullanım yasağı eklendi; FR-11 0 tutarlı fatura edge case eklendi; FR-05 UBL-TR versiyon adlandırması ve CopyIndicator/IssueTime gereksinimleri netleştirildi; x_gib_admin_notified alanı 1215 kodu davranışı güncellendi; AC-09 kabul kriteri düzeltildi.</w:t>
+              </w:r>
+            </w:ins>
+          </w:p>
+        </w:tc>
+        <w:tc>
+          <w:tcPr>
+            <w:tcW w:type="dxa" w:w="2000"/>
+            <w:tcBorders>
+              <w:top w:val="single" w:color="BBBBBB" w:sz="1"/>
+              <w:left w:val="single" w:color="BBBBBB" w:sz="1"/>
+              <w:bottom w:val="single" w:color="BBBBBB" w:sz="1"/>
+              <w:right w:val="single" w:color="BBBBBB" w:sz="1"/>
+            </w:tcBorders>
+            <w:shd w:fill="FFFFFF" w:val="clear"/>
+            <w:tcMar>
+              <w:top w:type="dxa" w:w="80"/>
+              <w:left w:type="dxa" w:w="120"/>
+              <w:bottom w:type="dxa" w:w="80"/>
+              <w:right w:type="dxa" w:w="120"/>
+            </w:tcMar>
+          </w:tcPr>
+          <w:p>
+            <w:ins w:id="124" w:author="Claude" w:date="2026-06-13T00:00:00Z">
+              <w:r>
+                <w:rPr>
+                  <w:rFonts w:ascii="Arial" w:cs="Arial" w:eastAsia="Arial" w:hAnsi="Arial"/>
+                  <w:color w:val="1A1A1A"/>
+                  <w:sz w:val="18"/>
+                  <w:szCs w:val="18"/>
+                </w:rPr>
+                <w:t xml:space="preserve">Proje Analiz</w:t>
+              </w:r>
+            </w:ins>
           </w:p>
         </w:tc>
       </w:tr>
@@ -27052,7 +27330,7 @@
                 <w:sz w:val="18"/>
                 <w:szCs w:val="18"/>
               </w:rPr>
-              <w:t xml:space="preserve">Odoo 18 × Sovos e-Fatura Spec v6.0 (Haziran 2026)</w:t>
+              <w:t xml:space="preserve">Odoo 18 × Sovos e-Fatura Spec v8.0 (Haziran 2026)</w:t>
             </w:r>
           </w:p>
         </w:tc>
@@ -27441,7 +27719,7 @@
           <w:sz w:val="16"/>
           <w:szCs w:val="16"/>
         </w:rPr>
-        <w:t xml:space="preserve">İş Gereksinimleri Analiz Dökümanı v1.0 — Odoo 18 × Sovos e-Fatura Entegrasyonu. Spec v6.0 baz alınarak hazırlanmıştır. Haziran 2026.</w:t>
+        <w:t xml:space="preserve">İş Gereksinimleri Analiz Dökümanı v1.4 — Odoo 18 × Sovos e-Fatura Entegrasyonu. Spec v8.0 ile uyumludur. Haziran 2026.</w:t>
       </w:r>
     </w:p>
     <w:sectPr>

</xml_diff>